<commit_message>
feat: update bot M5 & M15 to v3.4 (Technical Confluence Suite, Descending Triangle, Anti-Falling Knife, Symmetric RRR, Loop Shield resilience)
</commit_message>
<xml_diff>
--- a/PTA_Nouval_FIX.docx
+++ b/PTA_Nouval_FIX.docx
@@ -350,7 +350,6 @@
           <w:sz w:val="20"/>
         </w:rPr>
       </w:pPr>
-      <w:bookmarkStart w:id="0" w:name="_GoBack"/>
       <w:r>
         <w:rPr>
           <w:noProof/>
@@ -453,7 +452,6 @@
         </mc:AlternateContent>
       </w:r>
     </w:p>
-    <w:bookmarkEnd w:id="0"/>
     <w:p>
       <w:pPr>
         <w:pStyle w:val="Heading1"/>
@@ -1392,10 +1390,7 @@
         <w:t>gold vs US dollar</w:t>
       </w:r>
       <w:r>
-        <w:t xml:space="preserve"> atau XAUUSD) merupakan salah satu instrumen keuangan yang sangat likuid dan memiliki volatilitas harga yang dinamis. Pergerakan harga emas di pasar global tidak hanya terbentuk dari riwayat harga internalnya semata, melainkan sangat dipengaruhi oleh varia</w:t>
-      </w:r>
-      <w:r>
-        <w:t>bel eksternal makro, terutama kekuatan Indeks Dolar Amerika Serikat (</w:t>
+        <w:t xml:space="preserve"> atau XAUUSD) merupakan salah satu instrumen keuangan yang sangat likuid dan memiliki volatilitas harga yang dinamis. Pergerakan harga emas di pasar global tidak hanya terbentuk dari riwayat harga internalnya semata, melainkan sangat dipengaruhi oleh variabel eksternal makro, terutama kekuatan Indeks Dolar Amerika Serikat (</w:t>
       </w:r>
       <w:r>
         <w:rPr>
@@ -1428,13 +1423,7 @@
         <w:rPr>
           <w:i/>
         </w:rPr>
-        <w:t>Federal Open Mar</w:t>
-      </w:r>
-      <w:r>
-        <w:rPr>
-          <w:i/>
-        </w:rPr>
-        <w:t>ket Committee</w:t>
+        <w:t>Federal Open Market Committee</w:t>
       </w:r>
       <w:r>
         <w:t xml:space="preserve"> (FOMC). Interaksi antara pola teknikal di pasar dan sentimen ekonomi tersebut kerap memicu pergerakan harga yang tidak linear dengan derau (</w:t>
@@ -1463,13 +1452,7 @@
         <w:rPr>
           <w:i/>
         </w:rPr>
-        <w:t>time-s</w:t>
-      </w:r>
-      <w:r>
-        <w:rPr>
-          <w:i/>
-        </w:rPr>
-        <w:t>eries</w:t>
+        <w:t>time-series</w:t>
       </w:r>
       <w:r>
         <w:t xml:space="preserve"> finansial yang masih menjadi celah penelitian (</w:t>
@@ -1496,13 +1479,7 @@
         <w:rPr>
           <w:i/>
         </w:rPr>
-        <w:t>cross-mark</w:t>
-      </w:r>
-      <w:r>
-        <w:rPr>
-          <w:i/>
-        </w:rPr>
-        <w:t>et correlation</w:t>
+        <w:t>cross-market correlation</w:t>
       </w:r>
       <w:r>
         <w:t xml:space="preserve">) dengan Indeks DXY secara </w:t>
@@ -1529,13 +1506,7 @@
         <w:rPr>
           <w:i/>
         </w:rPr>
-        <w:t>single</w:t>
-      </w:r>
-      <w:r>
-        <w:rPr>
-          <w:i/>
-        </w:rPr>
-        <w:t>-timeframe</w:t>
+        <w:t>single-timeframe</w:t>
       </w:r>
       <w:r>
         <w:t xml:space="preserve"> sering kali mengabaikan tren besar pada </w:t>
@@ -1574,10 +1545,7 @@
         <w:t>machine learning</w:t>
       </w:r>
       <w:r>
-        <w:t xml:space="preserve"> </w:t>
-      </w:r>
-      <w:r>
-        <w:t>konvensional hanya mengeluarkan prediksi biner kaku (label naik atau turun) tanpa disertai tingkat keyakinan probabilitas yang terkalibrasi (</w:t>
+        <w:t xml:space="preserve"> konvensional hanya mengeluarkan prediksi biner kaku (label naik atau turun) tanpa disertai tingkat keyakinan probabilitas yang terkalibrasi (</w:t>
       </w:r>
       <w:r>
         <w:rPr>
@@ -1586,10 +1554,7 @@
         <w:t>calibrated confidence probability</w:t>
       </w:r>
       <w:r>
-        <w:t xml:space="preserve">), sehingga pengguna sulit membedakan kondisi pasar yang memiliki tren jelas dari </w:t>
-      </w:r>
-      <w:r>
-        <w:t>kondisi pasar yang sedang mendatar (</w:t>
+        <w:t>), sehingga pengguna sulit membedakan kondisi pasar yang memiliki tren jelas dari kondisi pasar yang sedang mendatar (</w:t>
       </w:r>
       <w:r>
         <w:rPr>
@@ -1627,10 +1592,7 @@
         <w:t>multi-source feature fusion</w:t>
       </w:r>
       <w:r>
-        <w:t xml:space="preserve"> yang memadukan 28 variabel prediktif. </w:t>
-      </w:r>
-      <w:r>
-        <w:t xml:space="preserve">Kebaruan penelitian ini terletak pada integrasi fitur teknikal </w:t>
+        <w:t xml:space="preserve"> yang memadukan 28 variabel prediktif. Kebaruan penelitian ini terletak pada integrasi fitur teknikal </w:t>
       </w:r>
       <w:r>
         <w:rPr>
@@ -1702,10 +1664,7 @@
         <w:t>Change of Character</w:t>
       </w:r>
       <w:r>
-        <w:t xml:space="preserve"> (CHoCH), d</w:t>
-      </w:r>
-      <w:r>
-        <w:t xml:space="preserve">an </w:t>
+        <w:t xml:space="preserve"> (CHoCH), dan </w:t>
       </w:r>
       <w:r>
         <w:rPr>
@@ -1789,13 +1748,7 @@
         <w:rPr>
           <w:i/>
         </w:rPr>
-        <w:t>Exponential Mov</w:t>
-      </w:r>
-      <w:r>
-        <w:rPr>
-          <w:i/>
-        </w:rPr>
-        <w:t>ing Average</w:t>
+        <w:t>Exponential Moving Average</w:t>
       </w:r>
       <w:r>
         <w:t xml:space="preserve"> (EMA 50 dan EMA 200). Model dirancang untuk menghasilkan keluaran nilai probabilitas keyakinan (rentang 0%–100%) dengan proteksi </w:t>
@@ -1816,10 +1769,7 @@
         <w:t>real-time zero-delay</w:t>
       </w:r>
       <w:r>
-        <w:t xml:space="preserve"> ke MetaTrader 5 API sebagai s</w:t>
-      </w:r>
-      <w:r>
-        <w:t>istem pendukung keputusan (</w:t>
+        <w:t xml:space="preserve"> ke MetaTrader 5 API sebagai sistem pendukung keputusan (</w:t>
       </w:r>
       <w:r>
         <w:rPr>
@@ -1872,13 +1822,7 @@
         <w:rPr>
           <w:i/>
         </w:rPr>
-        <w:t>multi-source feature</w:t>
-      </w:r>
-      <w:r>
-        <w:rPr>
-          <w:i/>
-        </w:rPr>
-        <w:t xml:space="preserve"> fusion</w:t>
+        <w:t>multi-source feature fusion</w:t>
       </w:r>
       <w:r>
         <w:t xml:space="preserve"> yang mengintegrasikan 28 variabel teknikal (geometri </w:t>
@@ -1994,10 +1938,7 @@
         <w:t>balanced class weights</w:t>
       </w:r>
       <w:r>
-        <w:t xml:space="preserve"> untuk menghasilkan prediksi probabilitas arah pergerakan harga XAUUSD yang terkalibrasi pada horizon </w:t>
-      </w:r>
-      <w:r>
-        <w:t xml:space="preserve">5 </w:t>
+        <w:t xml:space="preserve"> untuk menghasilkan prediksi probabilitas arah pergerakan harga XAUUSD yang terkalibrasi pada horizon 5 </w:t>
       </w:r>
       <w:r>
         <w:rPr>
@@ -2056,10 +1997,7 @@
         <w:t>forward testing</w:t>
       </w:r>
       <w:r>
-        <w:t xml:space="preserve"> otomatis terintegrasi Met</w:t>
-      </w:r>
-      <w:r>
-        <w:t>aTrader 5 API dengan manajemen risiko kuantitatif (</w:t>
+        <w:t xml:space="preserve"> otomatis terintegrasi MetaTrader 5 API dengan manajemen risiko kuantitatif (</w:t>
       </w:r>
       <w:r>
         <w:rPr>
@@ -2141,10 +2079,7 @@
         <w:t>multi-source feature fusion</w:t>
       </w:r>
       <w:r>
-        <w:t xml:space="preserve"> yang menge</w:t>
-      </w:r>
-      <w:r>
-        <w:t xml:space="preserve">kstraksi dan menyatukan 28 variabel prediktif dari pergerakan harga M15, struktur </w:t>
+        <w:t xml:space="preserve"> yang mengekstraksi dan menyatukan 28 variabel prediktif dari pergerakan harga M15, struktur </w:t>
       </w:r>
       <w:r>
         <w:rPr>
@@ -2176,10 +2111,7 @@
         <w:jc w:val="both"/>
       </w:pPr>
       <w:r>
-        <w:t>Mengembangkan model klasifikasi probabilitas menggunakan algoritma LightGBM</w:t>
-      </w:r>
-      <w:r>
-        <w:t xml:space="preserve"> untuk menghasilkan estimasi tingkat keyakinan (0%–100%) yang mampu menyaring peluang arah pergerakan harga dari derau (</w:t>
+        <w:t>Mengembangkan model klasifikasi probabilitas menggunakan algoritma LightGBM untuk menghasilkan estimasi tingkat keyakinan (0%–100%) yang mampu menyaring peluang arah pergerakan harga dari derau (</w:t>
       </w:r>
       <w:r>
         <w:rPr>
@@ -2211,10 +2143,7 @@
         <w:t>real-time zero-delay</w:t>
       </w:r>
       <w:r>
-        <w:t xml:space="preserve"> melalui MetaTrader 5 </w:t>
-      </w:r>
-      <w:r>
-        <w:t xml:space="preserve">API dengan pengaman </w:t>
+        <w:t xml:space="preserve"> melalui MetaTrader 5 API dengan pengaman </w:t>
       </w:r>
       <w:r>
         <w:rPr>
@@ -2343,13 +2272,7 @@
         <w:rPr>
           <w:i/>
         </w:rPr>
-        <w:t>Keilmuan Infor</w:t>
-      </w:r>
-      <w:r>
-        <w:rPr>
-          <w:i/>
-        </w:rPr>
-        <w:t>matika dan Data Science</w:t>
+        <w:t>Keilmuan Informatika dan Data Science</w:t>
       </w:r>
       <w:r>
         <w:t xml:space="preserve">): Memberikan kontribusi dalam penerapan algoritma </w:t>
@@ -2388,10 +2311,7 @@
         <w:t>multi-source feature fusion</w:t>
       </w:r>
       <w:r>
-        <w:t xml:space="preserve">), estimasi </w:t>
-      </w:r>
-      <w:r>
-        <w:t xml:space="preserve">probabilitas nonbiner, dan mitigasi </w:t>
+        <w:t xml:space="preserve">), estimasi probabilitas nonbiner, dan mitigasi </w:t>
       </w:r>
       <w:r>
         <w:rPr>
@@ -2432,10 +2352,7 @@
         <w:t>quantitative trader</w:t>
       </w:r>
       <w:r>
-        <w:t xml:space="preserve"> untuk membantu menguran</w:t>
-      </w:r>
-      <w:r>
-        <w:t>gi bias emosional melalui penyaringan tingkat keyakinan (</w:t>
+        <w:t xml:space="preserve"> untuk membantu mengurangi bias emosional melalui penyaringan tingkat keyakinan (</w:t>
       </w:r>
       <w:r>
         <w:rPr>
@@ -2483,13 +2400,7 @@
         <w:rPr>
           <w:i/>
         </w:rPr>
-        <w:t>mac</w:t>
-      </w:r>
-      <w:r>
-        <w:rPr>
-          <w:i/>
-        </w:rPr>
-        <w:t>hine learning</w:t>
+        <w:t>machine learning</w:t>
       </w:r>
       <w:r>
         <w:t xml:space="preserve"> berbasis Python langsung dengan terminal MetaTrader 5 secara </w:t>
@@ -2533,10 +2444,7 @@
         <w:jc w:val="both"/>
       </w:pPr>
       <w:r>
-        <w:t xml:space="preserve">Metodologi penelitian ini </w:t>
-      </w:r>
-      <w:r>
-        <w:t>dilaksanakan melalui 8 tahapan terstruktur sebagai berikut:</w:t>
+        <w:t>Metodologi penelitian ini dilaksanakan melalui 8 tahapan terstruktur sebagai berikut:</w:t>
       </w:r>
     </w:p>
     <w:p>
@@ -2635,10 +2543,7 @@
         <w:t>Scopus Open Access</w:t>
       </w:r>
       <w:r>
-        <w:t xml:space="preserve"> terbitan 2023–2</w:t>
-      </w:r>
-      <w:r>
-        <w:t>026 sebagai rujukan penelitian.</w:t>
+        <w:t xml:space="preserve"> terbitan 2023–2026 sebagai rujukan penelitian.</w:t>
       </w:r>
     </w:p>
     <w:p>
@@ -2709,10 +2614,7 @@
         <w:t>timeframe</w:t>
       </w:r>
       <w:r>
-        <w:t xml:space="preserve"> M15 dan H1 melalui MetaTrader 5 API; (b) data pergerakan Indeks Dola</w:t>
-      </w:r>
-      <w:r>
-        <w:t xml:space="preserve">r AS (DXY) secara </w:t>
+        <w:t xml:space="preserve"> M15 dan H1 melalui MetaTrader 5 API; (b) data pergerakan Indeks Dolar AS (DXY) secara </w:t>
       </w:r>
       <w:r>
         <w:rPr>
@@ -2823,10 +2725,7 @@
         <w:t>Smart Money Concepts</w:t>
       </w:r>
       <w:r>
-        <w:t xml:space="preserve"> (SMC) dan ICT y</w:t>
-      </w:r>
-      <w:r>
-        <w:t xml:space="preserve">ang mencakup </w:t>
+        <w:t xml:space="preserve"> (SMC) dan ICT yang mencakup </w:t>
       </w:r>
       <w:r>
         <w:rPr>
@@ -2943,10 +2842,7 @@
         <w:t>support</w:t>
       </w:r>
       <w:r>
-        <w:t xml:space="preserve"> </w:t>
-      </w:r>
-      <w:r>
-        <w:t xml:space="preserve">dan </w:t>
+        <w:t xml:space="preserve"> dan </w:t>
       </w:r>
       <w:r>
         <w:rPr>
@@ -3063,10 +2959,7 @@
         <w:t>BB_Pos</w:t>
       </w:r>
       <w:r>
-        <w:t>,</w:t>
-      </w:r>
-      <w:r>
-        <w:t xml:space="preserve"> </w:t>
+        <w:t xml:space="preserve">, </w:t>
       </w:r>
       <w:r>
         <w:rPr>
@@ -3204,10 +3097,7 @@
         <w:t>no random shuffling</w:t>
       </w:r>
       <w:r>
-        <w:t>) agar data uji benar-benar mencerminkan k</w:t>
-      </w:r>
-      <w:r>
-        <w:t>ondisi masa depan yang belum pernah dilihat model (</w:t>
+        <w:t>) agar data uji benar-benar mencerminkan kondisi masa depan yang belum pernah dilihat model (</w:t>
       </w:r>
       <w:r>
         <w:rPr>
@@ -3273,10 +3163,7 @@
         <w:t>LGBMClassifier</w:t>
       </w:r>
       <w:r>
-        <w:t xml:space="preserve">) dengan target biner arah pergerakan harga </w:t>
-      </w:r>
-      <w:r>
-        <w:t xml:space="preserve">untuk 5 </w:t>
+        <w:t xml:space="preserve">) dengan target biner arah pergerakan harga untuk 5 </w:t>
       </w:r>
       <w:r>
         <w:rPr>
@@ -3336,13 +3223,7 @@
         <w:rPr>
           <w:i/>
         </w:rPr>
-        <w:t>cla</w:t>
-      </w:r>
-      <w:r>
-        <w:rPr>
-          <w:i/>
-        </w:rPr>
-        <w:t>ss_weight</w:t>
+        <w:t>class_weight</w:t>
       </w:r>
       <w:r>
         <w:t xml:space="preserve"> = </w:t>
@@ -3434,10 +3315,7 @@
         <w:jc w:val="both"/>
       </w:pPr>
       <w:r>
-        <w:t>Menguji performa model menggun</w:t>
-      </w:r>
-      <w:r>
-        <w:t xml:space="preserve">akan metrik evaluasi probabilitas terstandarisasi, seperti </w:t>
+        <w:t xml:space="preserve">Menguji performa model menggunakan metrik evaluasi probabilitas terstandarisasi, seperti </w:t>
       </w:r>
       <w:r>
         <w:rPr>
@@ -3509,10 +3387,7 @@
         <w:t>benchmark</w:t>
       </w:r>
       <w:r>
-        <w:t>) dengan algoritma pemb</w:t>
-      </w:r>
-      <w:r>
-        <w:t xml:space="preserve">anding lain, yaitu XGBoost, </w:t>
+        <w:t xml:space="preserve">) dengan algoritma pembanding lain, yaitu XGBoost, </w:t>
       </w:r>
       <w:r>
         <w:rPr>
@@ -3603,10 +3478,7 @@
         <w:t>real-time zero-delay</w:t>
       </w:r>
       <w:r>
-        <w:t xml:space="preserve"> dengan MetaTrader</w:t>
-      </w:r>
-      <w:r>
-        <w:t xml:space="preserve"> 5 API. Sistem ini dilengkapi fitur: pencatat waktu mundur (</w:t>
+        <w:t xml:space="preserve"> dengan MetaTrader 5 API. Sistem ini dilengkapi fitur: pencatat waktu mundur (</w:t>
       </w:r>
       <w:r>
         <w:rPr>
@@ -3687,10 +3559,7 @@
         <w:t>auto break-even protection</w:t>
       </w:r>
       <w:r>
-        <w:t xml:space="preserve">) </w:t>
-      </w:r>
-      <w:r>
-        <w:t>saat posisi transaksi telah mengamankan profit tertentu.</w:t>
+        <w:t>) saat posisi transaksi telah mengamankan profit tertentu.</w:t>
       </w:r>
     </w:p>
     <w:p>
@@ -3842,13 +3711,7 @@
         <w:rPr>
           <w:sz w:val="24"/>
         </w:rPr>
-        <w:t>Al-Thaqeb, S., Algharabali, B. G., &amp; Al-Mutairi, A. (2026). Predictive model based on machine learning to determine</w:t>
-      </w:r>
-      <w:r>
-        <w:rPr>
-          <w:sz w:val="24"/>
-        </w:rPr>
-        <w:t xml:space="preserve"> gold price fluctuation and improve trading decisions. </w:t>
+        <w:t xml:space="preserve">Al-Thaqeb, S., Algharabali, B. G., &amp; Al-Mutairi, A. (2026). Predictive model based on machine learning to determine gold price fluctuation and improve trading decisions. </w:t>
       </w:r>
       <w:r>
         <w:rPr>
@@ -3887,13 +3750,7 @@
         <w:rPr>
           <w:sz w:val="24"/>
         </w:rPr>
-        <w:t>Ben Jabeur, S., Mefteh-Wali, S., &amp; Viviani, J. L. (2024). Forecasting gold price with the XGBoost algorithm an</w:t>
-      </w:r>
-      <w:r>
-        <w:rPr>
-          <w:sz w:val="24"/>
-        </w:rPr>
-        <w:t xml:space="preserve">d SHAP interaction values. </w:t>
+        <w:t xml:space="preserve">Ben Jabeur, S., Mefteh-Wali, S., &amp; Viviani, J. L. (2024). Forecasting gold price with the XGBoost algorithm and SHAP interaction values. </w:t>
       </w:r>
       <w:r>
         <w:rPr>
@@ -3958,13 +3815,7 @@
         <w:rPr>
           <w:sz w:val="24"/>
         </w:rPr>
-        <w:t>(4), 870. https</w:t>
-      </w:r>
-      <w:r>
-        <w:rPr>
-          <w:sz w:val="24"/>
-        </w:rPr>
-        <w:t>://doi.org/10.3390/sym15040870</w:t>
+        <w:t>(4), 870. https://doi.org/10.3390/sym15040870</w:t>
       </w:r>
     </w:p>
     <w:p>
@@ -4016,13 +3867,7 @@
         <w:rPr>
           <w:sz w:val="24"/>
         </w:rPr>
-        <w:t>KC, B., Sharma, P., &amp; Dahal, S. (202</w:t>
-      </w:r>
-      <w:r>
-        <w:rPr>
-          <w:sz w:val="24"/>
-        </w:rPr>
-        <w:t xml:space="preserve">4). Predicting the direction of NEPSE index movement with news headlines using machine learning algorithms. </w:t>
+        <w:t xml:space="preserve">KC, B., Sharma, P., &amp; Dahal, S. (2024). Predicting the direction of NEPSE index movement with news headlines using machine learning algorithms. </w:t>
       </w:r>
       <w:r>
         <w:rPr>
@@ -4061,13 +3906,7 @@
         <w:rPr>
           <w:sz w:val="24"/>
         </w:rPr>
-        <w:t xml:space="preserve">Liu, J. (2024). Predicting Chinese stock market using XGBoost multi-objective </w:t>
-      </w:r>
-      <w:r>
-        <w:rPr>
-          <w:sz w:val="24"/>
-        </w:rPr>
-        <w:t xml:space="preserve">optimization with optimal weighting. </w:t>
+        <w:t xml:space="preserve">Liu, J. (2024). Predicting Chinese stock market using XGBoost multi-objective optimization with optimal weighting. </w:t>
       </w:r>
       <w:r>
         <w:rPr>
@@ -4106,13 +3945,7 @@
         <w:rPr>
           <w:sz w:val="24"/>
         </w:rPr>
-        <w:t>Nguyen, T., Vo, X. V., &amp; Le, H. (2025). Impact of global risk sentiment, gold prices, and interest rate differentials on financial market stabilit</w:t>
-      </w:r>
-      <w:r>
-        <w:rPr>
-          <w:sz w:val="24"/>
-        </w:rPr>
-        <w:t xml:space="preserve">y. </w:t>
+        <w:t xml:space="preserve">Nguyen, T., Vo, X. V., &amp; Le, H. (2025). Impact of global risk sentiment, gold prices, and interest rate differentials on financial market stability. </w:t>
       </w:r>
       <w:r>
         <w:rPr>
@@ -4177,13 +4010,7 @@
         <w:rPr>
           <w:sz w:val="24"/>
         </w:rPr>
-        <w:t xml:space="preserve">(21), 4551. </w:t>
-      </w:r>
-      <w:r>
-        <w:rPr>
-          <w:sz w:val="24"/>
-        </w:rPr>
-        <w:t>https://doi.org/10.3390/electronics12214551</w:t>
+        <w:t>(21), 4551. https://doi.org/10.3390/electronics12214551</w:t>
       </w:r>
     </w:p>
     <w:p>
@@ -4274,13 +4101,7 @@
         <w:rPr>
           <w:sz w:val="24"/>
         </w:rPr>
-        <w:t>Subeesh, P., Thomas, A., &amp; Mathew, J. (2025). A framework for go</w:t>
-      </w:r>
-      <w:r>
-        <w:rPr>
-          <w:sz w:val="24"/>
-        </w:rPr>
-        <w:t xml:space="preserve">ld price prediction combining classical time-series and intelligent machine learning methods. </w:t>
+        <w:t xml:space="preserve">Subeesh, P., Thomas, A., &amp; Mathew, J. (2025). A framework for gold price prediction combining classical time-series and intelligent machine learning methods. </w:t>
       </w:r>
       <w:r>
         <w:rPr>
@@ -4319,13 +4140,7 @@
         <w:rPr>
           <w:sz w:val="24"/>
         </w:rPr>
-        <w:t>Vancsura, L., Tatay, T., &amp; Bareith, T. (2023). Evaluating the effecti</w:t>
-      </w:r>
-      <w:r>
-        <w:rPr>
-          <w:sz w:val="24"/>
-        </w:rPr>
-        <w:t xml:space="preserve">veness of modern forecasting models in predicting commodity futures prices in volatile economic times. </w:t>
+        <w:t xml:space="preserve">Vancsura, L., Tatay, T., &amp; Bareith, T. (2023). Evaluating the effectiveness of modern forecasting models in predicting commodity futures prices in volatile economic times. </w:t>
       </w:r>
       <w:r>
         <w:rPr>
@@ -4364,13 +4179,7 @@
         <w:rPr>
           <w:sz w:val="24"/>
         </w:rPr>
-        <w:t>Wang, Y., &amp; Lin, T. (2024). A novel deterministic probabilistic forecasting framework for gold pr</w:t>
-      </w:r>
-      <w:r>
-        <w:rPr>
-          <w:sz w:val="24"/>
-        </w:rPr>
-        <w:t xml:space="preserve">ice with a new pandemic index based on quantile regression deep learning. </w:t>
+        <w:t xml:space="preserve">Wang, Y., &amp; Lin, T. (2024). A novel deterministic probabilistic forecasting framework for gold price with a new pandemic index based on quantile regression deep learning. </w:t>
       </w:r>
       <w:r>
         <w:rPr>
@@ -4409,13 +4218,7 @@
         <w:rPr>
           <w:sz w:val="24"/>
         </w:rPr>
-        <w:t>Zhao, X., Sun, Y., &amp; Li, M. (2026). Forecasting gold price with integrated media sentiment using CNN-QRLSTM neural networ</w:t>
-      </w:r>
-      <w:r>
-        <w:rPr>
-          <w:sz w:val="24"/>
-        </w:rPr>
-        <w:t xml:space="preserve">k. </w:t>
+        <w:t xml:space="preserve">Zhao, X., Sun, Y., &amp; Li, M. (2026). Forecasting gold price with integrated media sentiment using CNN-QRLSTM neural network. </w:t>
       </w:r>
       <w:r>
         <w:rPr>
@@ -5274,6 +5077,9 @@
         </w:tabs>
         <w:spacing w:before="40"/>
         <w:ind w:left="427"/>
+        <w:rPr>
+          <w:lang w:val="en-US"/>
+        </w:rPr>
       </w:pPr>
       <w:r>
         <w:t>dengan</w:t>
@@ -5656,8 +5462,13 @@
       <w:pPr>
         <w:pStyle w:val="BodyText"/>
         <w:spacing w:before="90"/>
-        <w:ind w:left="1679"/>
-      </w:pPr>
+      </w:pPr>
+      <w:r>
+        <w:rPr>
+          <w:lang w:val="en-US"/>
+        </w:rPr>
+        <w:t xml:space="preserve">                     </w:t>
+      </w:r>
       <w:r>
         <w:t>Dosen</w:t>
       </w:r>
@@ -5692,23 +5503,27 @@
     <w:p>
       <w:pPr>
         <w:pStyle w:val="BodyText"/>
-        <w:tabs>
-          <w:tab w:val="left" w:pos="3890"/>
-        </w:tabs>
         <w:spacing w:before="1" w:line="276" w:lineRule="auto"/>
-        <w:ind w:left="1279" w:right="38" w:firstLine="12"/>
+        <w:ind w:left="1279" w:right="-219" w:hanging="829"/>
+        <w:rPr>
+          <w:lang w:val="en-US"/>
+        </w:rPr>
       </w:pPr>
       <w:r>
         <w:rPr>
           <w:spacing w:val="-10"/>
+          <w:lang w:val="en-US"/>
+        </w:rPr>
+        <w:t xml:space="preserve">   </w:t>
+      </w:r>
+      <w:r>
+        <w:rPr>
+          <w:spacing w:val="-10"/>
         </w:rPr>
         <w:t>(</w:t>
       </w:r>
       <w:r>
-        <w:rPr>
-          <w:u w:val="single" w:color="B0B0B0"/>
-        </w:rPr>
-        <w:tab/>
+        <w:t>Ahmad Taufiq Akbar S.Si., M.Cs.</w:t>
       </w:r>
       <w:r>
         <w:rPr>
@@ -5721,6 +5536,22 @@
           <w:spacing w:val="-2"/>
         </w:rPr>
         <w:t>NIDN:</w:t>
+      </w:r>
+      <w:r>
+        <w:rPr>
+          <w:spacing w:val="-2"/>
+          <w:lang w:val="en-US"/>
+        </w:rPr>
+        <w:t xml:space="preserve"> </w:t>
+      </w:r>
+      <w:bookmarkStart w:id="0" w:name="_GoBack"/>
+      <w:bookmarkEnd w:id="0"/>
+      <w:r>
+        <w:rPr>
+          <w:spacing w:val="-2"/>
+          <w:lang w:val="en-US"/>
+        </w:rPr>
+        <w:t>0518118701</w:t>
       </w:r>
     </w:p>
     <w:p>
@@ -5817,7 +5648,7 @@
           <w:type w:val="continuous"/>
           <w:pgSz w:w="11910" w:h="16840"/>
           <w:pgMar w:top="900" w:right="566" w:bottom="280" w:left="1275" w:header="720" w:footer="720" w:gutter="0"/>
-          <w:cols w:num="2" w:space="720" w:equalWidth="0">
+          <w:cols w:num="2" w:space="393" w:equalWidth="0">
             <w:col w:w="4011" w:space="108"/>
             <w:col w:w="5950"/>
           </w:cols>
@@ -6332,7 +6163,6 @@
       <w:lvlJc w:val="left"/>
       <w:pPr>
         <w:ind w:left="1147" w:hanging="720"/>
-        <w:jc w:val="left"/>
       </w:pPr>
       <w:rPr>
         <w:rFonts w:hint="default"/>
@@ -6346,7 +6176,6 @@
       <w:lvlJc w:val="left"/>
       <w:pPr>
         <w:ind w:left="1147" w:hanging="720"/>
-        <w:jc w:val="left"/>
       </w:pPr>
       <w:rPr>
         <w:rFonts w:ascii="Times New Roman" w:eastAsia="Times New Roman" w:hAnsi="Times New Roman" w:cs="Times New Roman" w:hint="default"/>
@@ -6368,7 +6197,6 @@
       <w:lvlJc w:val="left"/>
       <w:pPr>
         <w:ind w:left="1507" w:hanging="360"/>
-        <w:jc w:val="left"/>
       </w:pPr>
       <w:rPr>
         <w:rFonts w:ascii="Times New Roman" w:eastAsia="Times New Roman" w:hAnsi="Times New Roman" w:cs="Times New Roman" w:hint="default"/>
@@ -6645,7 +6473,6 @@
       <w:lvlJc w:val="left"/>
       <w:pPr>
         <w:ind w:left="1507" w:hanging="360"/>
-        <w:jc w:val="left"/>
       </w:pPr>
       <w:rPr>
         <w:rFonts w:ascii="Times New Roman" w:eastAsia="Times New Roman" w:hAnsi="Times New Roman" w:cs="Times New Roman" w:hint="default"/>

</xml_diff>